<commit_message>
april 17th meeting minutes init
</commit_message>
<xml_diff>
--- a/documentation/MeetingMinutes.docx
+++ b/documentation/MeetingMinutes.docx
@@ -1435,6 +1435,13 @@
                 <w:u w:val="single"/>
               </w:rPr>
             </w:pPr>
+            <w:r>
+              <w:rPr>
+                <w:color w:val="000000"/>
+                <w:u w:val="single"/>
+              </w:rPr>
+              <w:t>04/10/2026</w:t>
+            </w:r>
           </w:p>
         </w:tc>
         <w:tc>
@@ -1455,6 +1462,12 @@
                 <w:color w:val="000000"/>
               </w:rPr>
             </w:pPr>
+            <w:r>
+              <w:rPr>
+                <w:color w:val="000000"/>
+              </w:rPr>
+              <w:t>1.9</w:t>
+            </w:r>
           </w:p>
         </w:tc>
         <w:tc>
@@ -1475,6 +1488,25 @@
                 <w:color w:val="000000"/>
               </w:rPr>
             </w:pPr>
+            <w:r>
+              <w:rPr>
+                <w:color w:val="000000"/>
+              </w:rPr>
+              <w:t>April 10</w:t>
+            </w:r>
+            <w:r>
+              <w:rPr>
+                <w:color w:val="000000"/>
+                <w:vertAlign w:val="superscript"/>
+              </w:rPr>
+              <w:t>th</w:t>
+            </w:r>
+            <w:r>
+              <w:rPr>
+                <w:color w:val="000000"/>
+              </w:rPr>
+              <w:t xml:space="preserve"> Meeting</w:t>
+            </w:r>
           </w:p>
         </w:tc>
         <w:tc>
@@ -1496,6 +1528,12 @@
                 <w:color w:val="000000"/>
               </w:rPr>
             </w:pPr>
+            <w:r>
+              <w:rPr>
+                <w:color w:val="000000"/>
+              </w:rPr>
+              <w:t>Darien D. Chau</w:t>
+            </w:r>
           </w:p>
         </w:tc>
       </w:tr>
@@ -1519,6 +1557,13 @@
                 <w:u w:val="single"/>
               </w:rPr>
             </w:pPr>
+            <w:r>
+              <w:rPr>
+                <w:color w:val="000000"/>
+                <w:u w:val="single"/>
+              </w:rPr>
+              <w:t>04/13/2026</w:t>
+            </w:r>
           </w:p>
         </w:tc>
         <w:tc>
@@ -1539,6 +1584,12 @@
                 <w:color w:val="000000"/>
               </w:rPr>
             </w:pPr>
+            <w:r>
+              <w:rPr>
+                <w:color w:val="000000"/>
+              </w:rPr>
+              <w:t>2.0</w:t>
+            </w:r>
           </w:p>
         </w:tc>
         <w:tc>
@@ -1559,6 +1610,25 @@
                 <w:color w:val="000000"/>
               </w:rPr>
             </w:pPr>
+            <w:r>
+              <w:rPr>
+                <w:color w:val="000000"/>
+              </w:rPr>
+              <w:t>April 13</w:t>
+            </w:r>
+            <w:r>
+              <w:rPr>
+                <w:color w:val="000000"/>
+                <w:vertAlign w:val="superscript"/>
+              </w:rPr>
+              <w:t>th</w:t>
+            </w:r>
+            <w:r>
+              <w:rPr>
+                <w:color w:val="000000"/>
+              </w:rPr>
+              <w:t xml:space="preserve"> Meeting</w:t>
+            </w:r>
           </w:p>
         </w:tc>
         <w:tc>
@@ -1580,6 +1650,12 @@
                 <w:color w:val="000000"/>
               </w:rPr>
             </w:pPr>
+            <w:r>
+              <w:rPr>
+                <w:color w:val="000000"/>
+              </w:rPr>
+              <w:t>Darien D. Chau</w:t>
+            </w:r>
           </w:p>
         </w:tc>
       </w:tr>
@@ -1603,6 +1679,13 @@
                 <w:u w:val="single"/>
               </w:rPr>
             </w:pPr>
+            <w:r>
+              <w:rPr>
+                <w:color w:val="000000"/>
+                <w:u w:val="single"/>
+              </w:rPr>
+              <w:t>04/17/2026</w:t>
+            </w:r>
           </w:p>
         </w:tc>
         <w:tc>
@@ -1623,6 +1706,12 @@
                 <w:color w:val="000000"/>
               </w:rPr>
             </w:pPr>
+            <w:r>
+              <w:rPr>
+                <w:color w:val="000000"/>
+              </w:rPr>
+              <w:t>2.1</w:t>
+            </w:r>
           </w:p>
         </w:tc>
         <w:tc>
@@ -1643,6 +1732,25 @@
                 <w:color w:val="000000"/>
               </w:rPr>
             </w:pPr>
+            <w:r>
+              <w:rPr>
+                <w:color w:val="000000"/>
+              </w:rPr>
+              <w:t>April 17</w:t>
+            </w:r>
+            <w:r>
+              <w:rPr>
+                <w:color w:val="000000"/>
+                <w:vertAlign w:val="superscript"/>
+              </w:rPr>
+              <w:t>th</w:t>
+            </w:r>
+            <w:r>
+              <w:rPr>
+                <w:color w:val="000000"/>
+              </w:rPr>
+              <w:t xml:space="preserve"> Meeting</w:t>
+            </w:r>
           </w:p>
         </w:tc>
         <w:tc>
@@ -1664,6 +1772,12 @@
                 <w:color w:val="000000"/>
               </w:rPr>
             </w:pPr>
+            <w:r>
+              <w:rPr>
+                <w:color w:val="000000"/>
+              </w:rPr>
+              <w:t>Darien D. Chau</w:t>
+            </w:r>
           </w:p>
         </w:tc>
       </w:tr>
@@ -2260,7 +2374,7 @@
           <w:r>
             <w:fldChar w:fldCharType="separate"/>
           </w:r>
-          <w:hyperlink w:anchor="_Toc225232349" w:history="1">
+          <w:hyperlink w:anchor="_Toc227324883" w:history="1">
             <w:r>
               <w:rPr>
                 <w:rStyle w:val="Hyperlink"/>
@@ -2299,7 +2413,7 @@
               <w:rPr>
                 <w:noProof/>
               </w:rPr>
-              <w:instrText xml:space="preserve"> PAGEREF _Toc225232349 \h </w:instrText>
+              <w:instrText xml:space="preserve"> PAGEREF _Toc227324883 \h </w:instrText>
             </w:r>
             <w:r>
               <w:rPr>
@@ -2341,7 +2455,7 @@
               <w14:ligatures w14:val="standardContextual"/>
             </w:rPr>
           </w:pPr>
-          <w:hyperlink w:anchor="_Toc225232350" w:history="1">
+          <w:hyperlink w:anchor="_Toc227324884" w:history="1">
             <w:r>
               <w:rPr>
                 <w:rStyle w:val="Hyperlink"/>
@@ -2380,7 +2494,7 @@
               <w:rPr>
                 <w:noProof/>
               </w:rPr>
-              <w:instrText xml:space="preserve"> PAGEREF _Toc225232350 \h </w:instrText>
+              <w:instrText xml:space="preserve"> PAGEREF _Toc227324884 \h </w:instrText>
             </w:r>
             <w:r>
               <w:rPr>
@@ -2422,7 +2536,7 @@
               <w14:ligatures w14:val="standardContextual"/>
             </w:rPr>
           </w:pPr>
-          <w:hyperlink w:anchor="_Toc225232351" w:history="1">
+          <w:hyperlink w:anchor="_Toc227324885" w:history="1">
             <w:r>
               <w:rPr>
                 <w:rStyle w:val="Hyperlink"/>
@@ -2461,7 +2575,7 @@
               <w:rPr>
                 <w:noProof/>
               </w:rPr>
-              <w:instrText xml:space="preserve"> PAGEREF _Toc225232351 \h </w:instrText>
+              <w:instrText xml:space="preserve"> PAGEREF _Toc227324885 \h </w:instrText>
             </w:r>
             <w:r>
               <w:rPr>
@@ -2503,7 +2617,7 @@
               <w14:ligatures w14:val="standardContextual"/>
             </w:rPr>
           </w:pPr>
-          <w:hyperlink w:anchor="_Toc225232352" w:history="1">
+          <w:hyperlink w:anchor="_Toc227324886" w:history="1">
             <w:r>
               <w:rPr>
                 <w:rStyle w:val="Hyperlink"/>
@@ -2542,7 +2656,7 @@
               <w:rPr>
                 <w:noProof/>
               </w:rPr>
-              <w:instrText xml:space="preserve"> PAGEREF _Toc225232352 \h </w:instrText>
+              <w:instrText xml:space="preserve"> PAGEREF _Toc227324886 \h </w:instrText>
             </w:r>
             <w:r>
               <w:rPr>
@@ -2584,7 +2698,7 @@
               <w14:ligatures w14:val="standardContextual"/>
             </w:rPr>
           </w:pPr>
-          <w:hyperlink w:anchor="_Toc225232353" w:history="1">
+          <w:hyperlink w:anchor="_Toc227324887" w:history="1">
             <w:r>
               <w:rPr>
                 <w:rStyle w:val="Hyperlink"/>
@@ -2623,7 +2737,7 @@
               <w:rPr>
                 <w:noProof/>
               </w:rPr>
-              <w:instrText xml:space="preserve"> PAGEREF _Toc225232353 \h </w:instrText>
+              <w:instrText xml:space="preserve"> PAGEREF _Toc227324887 \h </w:instrText>
             </w:r>
             <w:r>
               <w:rPr>
@@ -2640,7 +2754,7 @@
               <w:rPr>
                 <w:noProof/>
               </w:rPr>
-              <w:t>6</w:t>
+              <w:t>7</w:t>
             </w:r>
             <w:r>
               <w:rPr>
@@ -2665,7 +2779,7 @@
               <w14:ligatures w14:val="standardContextual"/>
             </w:rPr>
           </w:pPr>
-          <w:hyperlink w:anchor="_Toc225232354" w:history="1">
+          <w:hyperlink w:anchor="_Toc227324888" w:history="1">
             <w:r>
               <w:rPr>
                 <w:rStyle w:val="Hyperlink"/>
@@ -2697,7 +2811,7 @@
               <w:rPr>
                 <w:noProof/>
               </w:rPr>
-              <w:instrText xml:space="preserve"> PAGEREF _Toc225232354 \h </w:instrText>
+              <w:instrText xml:space="preserve"> PAGEREF _Toc227324888 \h </w:instrText>
             </w:r>
             <w:r>
               <w:rPr>
@@ -2739,7 +2853,7 @@
               <w14:ligatures w14:val="standardContextual"/>
             </w:rPr>
           </w:pPr>
-          <w:hyperlink w:anchor="_Toc225232355" w:history="1">
+          <w:hyperlink w:anchor="_Toc227324889" w:history="1">
             <w:r>
               <w:rPr>
                 <w:rStyle w:val="Hyperlink"/>
@@ -2771,7 +2885,7 @@
               <w:rPr>
                 <w:noProof/>
               </w:rPr>
-              <w:instrText xml:space="preserve"> PAGEREF _Toc225232355 \h </w:instrText>
+              <w:instrText xml:space="preserve"> PAGEREF _Toc227324889 \h </w:instrText>
             </w:r>
             <w:r>
               <w:rPr>
@@ -2813,7 +2927,7 @@
               <w14:ligatures w14:val="standardContextual"/>
             </w:rPr>
           </w:pPr>
-          <w:hyperlink w:anchor="_Toc225232356" w:history="1">
+          <w:hyperlink w:anchor="_Toc227324890" w:history="1">
             <w:r>
               <w:rPr>
                 <w:rStyle w:val="Hyperlink"/>
@@ -2845,7 +2959,7 @@
               <w:rPr>
                 <w:noProof/>
               </w:rPr>
-              <w:instrText xml:space="preserve"> PAGEREF _Toc225232356 \h </w:instrText>
+              <w:instrText xml:space="preserve"> PAGEREF _Toc227324890 \h </w:instrText>
             </w:r>
             <w:r>
               <w:rPr>
@@ -2887,7 +3001,7 @@
               <w14:ligatures w14:val="standardContextual"/>
             </w:rPr>
           </w:pPr>
-          <w:hyperlink w:anchor="_Toc225232357" w:history="1">
+          <w:hyperlink w:anchor="_Toc227324891" w:history="1">
             <w:r>
               <w:rPr>
                 <w:rStyle w:val="Hyperlink"/>
@@ -2919,7 +3033,7 @@
               <w:rPr>
                 <w:noProof/>
               </w:rPr>
-              <w:instrText xml:space="preserve"> PAGEREF _Toc225232357 \h </w:instrText>
+              <w:instrText xml:space="preserve"> PAGEREF _Toc227324891 \h </w:instrText>
             </w:r>
             <w:r>
               <w:rPr>
@@ -2937,6 +3051,376 @@
                 <w:noProof/>
               </w:rPr>
               <w:t>9</w:t>
+            </w:r>
+            <w:r>
+              <w:rPr>
+                <w:noProof/>
+              </w:rPr>
+              <w:fldChar w:fldCharType="end"/>
+            </w:r>
+          </w:hyperlink>
+        </w:p>
+        <w:p>
+          <w:pPr>
+            <w:pStyle w:val="TOC1"/>
+            <w:rPr>
+              <w:rFonts w:asciiTheme="minorHAnsi" w:eastAsiaTheme="minorEastAsia" w:hAnsiTheme="minorHAnsi" w:cstheme="minorBidi"/>
+              <w:b w:val="0"/>
+              <w:caps w:val="0"/>
+              <w:noProof/>
+              <w:kern w:val="2"/>
+              <w:sz w:val="24"/>
+              <w:szCs w:val="24"/>
+              <w:lang w:eastAsia="en-US"/>
+              <w14:ligatures w14:val="standardContextual"/>
+            </w:rPr>
+          </w:pPr>
+          <w:hyperlink w:anchor="_Toc227324892" w:history="1">
+            <w:r>
+              <w:rPr>
+                <w:rStyle w:val="Hyperlink"/>
+                <w:noProof/>
+              </w:rPr>
+              <w:t>March 27</w:t>
+            </w:r>
+            <w:r>
+              <w:rPr>
+                <w:rStyle w:val="Hyperlink"/>
+                <w:noProof/>
+                <w:vertAlign w:val="superscript"/>
+              </w:rPr>
+              <w:t>th</w:t>
+            </w:r>
+            <w:r>
+              <w:rPr>
+                <w:noProof/>
+              </w:rPr>
+              <w:tab/>
+            </w:r>
+            <w:r>
+              <w:rPr>
+                <w:noProof/>
+              </w:rPr>
+              <w:fldChar w:fldCharType="begin"/>
+            </w:r>
+            <w:r>
+              <w:rPr>
+                <w:noProof/>
+              </w:rPr>
+              <w:instrText xml:space="preserve"> PAGEREF _Toc227324892 \h </w:instrText>
+            </w:r>
+            <w:r>
+              <w:rPr>
+                <w:noProof/>
+              </w:rPr>
+            </w:r>
+            <w:r>
+              <w:rPr>
+                <w:noProof/>
+              </w:rPr>
+              <w:fldChar w:fldCharType="separate"/>
+            </w:r>
+            <w:r>
+              <w:rPr>
+                <w:noProof/>
+              </w:rPr>
+              <w:t>10</w:t>
+            </w:r>
+            <w:r>
+              <w:rPr>
+                <w:noProof/>
+              </w:rPr>
+              <w:fldChar w:fldCharType="end"/>
+            </w:r>
+          </w:hyperlink>
+        </w:p>
+        <w:p>
+          <w:pPr>
+            <w:pStyle w:val="TOC1"/>
+            <w:rPr>
+              <w:rFonts w:asciiTheme="minorHAnsi" w:eastAsiaTheme="minorEastAsia" w:hAnsiTheme="minorHAnsi" w:cstheme="minorBidi"/>
+              <w:b w:val="0"/>
+              <w:caps w:val="0"/>
+              <w:noProof/>
+              <w:kern w:val="2"/>
+              <w:sz w:val="24"/>
+              <w:szCs w:val="24"/>
+              <w:lang w:eastAsia="en-US"/>
+              <w14:ligatures w14:val="standardContextual"/>
+            </w:rPr>
+          </w:pPr>
+          <w:hyperlink w:anchor="_Toc227324893" w:history="1">
+            <w:r>
+              <w:rPr>
+                <w:rStyle w:val="Hyperlink"/>
+                <w:noProof/>
+              </w:rPr>
+              <w:t>April 4</w:t>
+            </w:r>
+            <w:r>
+              <w:rPr>
+                <w:rStyle w:val="Hyperlink"/>
+                <w:noProof/>
+                <w:vertAlign w:val="superscript"/>
+              </w:rPr>
+              <w:t>th</w:t>
+            </w:r>
+            <w:r>
+              <w:rPr>
+                <w:noProof/>
+              </w:rPr>
+              <w:tab/>
+            </w:r>
+            <w:r>
+              <w:rPr>
+                <w:noProof/>
+              </w:rPr>
+              <w:fldChar w:fldCharType="begin"/>
+            </w:r>
+            <w:r>
+              <w:rPr>
+                <w:noProof/>
+              </w:rPr>
+              <w:instrText xml:space="preserve"> PAGEREF _Toc227324893 \h </w:instrText>
+            </w:r>
+            <w:r>
+              <w:rPr>
+                <w:noProof/>
+              </w:rPr>
+            </w:r>
+            <w:r>
+              <w:rPr>
+                <w:noProof/>
+              </w:rPr>
+              <w:fldChar w:fldCharType="separate"/>
+            </w:r>
+            <w:r>
+              <w:rPr>
+                <w:noProof/>
+              </w:rPr>
+              <w:t>11</w:t>
+            </w:r>
+            <w:r>
+              <w:rPr>
+                <w:noProof/>
+              </w:rPr>
+              <w:fldChar w:fldCharType="end"/>
+            </w:r>
+          </w:hyperlink>
+        </w:p>
+        <w:p>
+          <w:pPr>
+            <w:pStyle w:val="TOC1"/>
+            <w:rPr>
+              <w:rFonts w:asciiTheme="minorHAnsi" w:eastAsiaTheme="minorEastAsia" w:hAnsiTheme="minorHAnsi" w:cstheme="minorBidi"/>
+              <w:b w:val="0"/>
+              <w:caps w:val="0"/>
+              <w:noProof/>
+              <w:kern w:val="2"/>
+              <w:sz w:val="24"/>
+              <w:szCs w:val="24"/>
+              <w:lang w:eastAsia="en-US"/>
+              <w14:ligatures w14:val="standardContextual"/>
+            </w:rPr>
+          </w:pPr>
+          <w:hyperlink w:anchor="_Toc227324894" w:history="1">
+            <w:r>
+              <w:rPr>
+                <w:rStyle w:val="Hyperlink"/>
+                <w:noProof/>
+              </w:rPr>
+              <w:t>April 8</w:t>
+            </w:r>
+            <w:r>
+              <w:rPr>
+                <w:rStyle w:val="Hyperlink"/>
+                <w:noProof/>
+                <w:vertAlign w:val="superscript"/>
+              </w:rPr>
+              <w:t>th</w:t>
+            </w:r>
+            <w:r>
+              <w:rPr>
+                <w:noProof/>
+              </w:rPr>
+              <w:tab/>
+            </w:r>
+            <w:r>
+              <w:rPr>
+                <w:noProof/>
+              </w:rPr>
+              <w:fldChar w:fldCharType="begin"/>
+            </w:r>
+            <w:r>
+              <w:rPr>
+                <w:noProof/>
+              </w:rPr>
+              <w:instrText xml:space="preserve"> PAGEREF _Toc227324894 \h </w:instrText>
+            </w:r>
+            <w:r>
+              <w:rPr>
+                <w:noProof/>
+              </w:rPr>
+            </w:r>
+            <w:r>
+              <w:rPr>
+                <w:noProof/>
+              </w:rPr>
+              <w:fldChar w:fldCharType="separate"/>
+            </w:r>
+            <w:r>
+              <w:rPr>
+                <w:noProof/>
+              </w:rPr>
+              <w:t>12</w:t>
+            </w:r>
+            <w:r>
+              <w:rPr>
+                <w:noProof/>
+              </w:rPr>
+              <w:fldChar w:fldCharType="end"/>
+            </w:r>
+          </w:hyperlink>
+        </w:p>
+        <w:p>
+          <w:pPr>
+            <w:pStyle w:val="TOC1"/>
+            <w:rPr>
+              <w:rFonts w:asciiTheme="minorHAnsi" w:eastAsiaTheme="minorEastAsia" w:hAnsiTheme="minorHAnsi" w:cstheme="minorBidi"/>
+              <w:b w:val="0"/>
+              <w:caps w:val="0"/>
+              <w:noProof/>
+              <w:kern w:val="2"/>
+              <w:sz w:val="24"/>
+              <w:szCs w:val="24"/>
+              <w:lang w:eastAsia="en-US"/>
+              <w14:ligatures w14:val="standardContextual"/>
+            </w:rPr>
+          </w:pPr>
+          <w:hyperlink w:anchor="_Toc227324895" w:history="1">
+            <w:r>
+              <w:rPr>
+                <w:rStyle w:val="Hyperlink"/>
+                <w:noProof/>
+              </w:rPr>
+              <w:t>April 10</w:t>
+            </w:r>
+            <w:r>
+              <w:rPr>
+                <w:rStyle w:val="Hyperlink"/>
+                <w:noProof/>
+                <w:vertAlign w:val="superscript"/>
+              </w:rPr>
+              <w:t>th</w:t>
+            </w:r>
+            <w:r>
+              <w:rPr>
+                <w:noProof/>
+              </w:rPr>
+              <w:tab/>
+            </w:r>
+            <w:r>
+              <w:rPr>
+                <w:noProof/>
+              </w:rPr>
+              <w:fldChar w:fldCharType="begin"/>
+            </w:r>
+            <w:r>
+              <w:rPr>
+                <w:noProof/>
+              </w:rPr>
+              <w:instrText xml:space="preserve"> PAGEREF _Toc227324895 \h </w:instrText>
+            </w:r>
+            <w:r>
+              <w:rPr>
+                <w:noProof/>
+              </w:rPr>
+            </w:r>
+            <w:r>
+              <w:rPr>
+                <w:noProof/>
+              </w:rPr>
+              <w:fldChar w:fldCharType="separate"/>
+            </w:r>
+            <w:r>
+              <w:rPr>
+                <w:noProof/>
+              </w:rPr>
+              <w:t>13</w:t>
+            </w:r>
+            <w:r>
+              <w:rPr>
+                <w:noProof/>
+              </w:rPr>
+              <w:fldChar w:fldCharType="end"/>
+            </w:r>
+          </w:hyperlink>
+        </w:p>
+        <w:p>
+          <w:pPr>
+            <w:pStyle w:val="TOC1"/>
+            <w:rPr>
+              <w:rFonts w:asciiTheme="minorHAnsi" w:eastAsiaTheme="minorEastAsia" w:hAnsiTheme="minorHAnsi" w:cstheme="minorBidi"/>
+              <w:b w:val="0"/>
+              <w:caps w:val="0"/>
+              <w:noProof/>
+              <w:kern w:val="2"/>
+              <w:sz w:val="24"/>
+              <w:szCs w:val="24"/>
+              <w:lang w:eastAsia="en-US"/>
+              <w14:ligatures w14:val="standardContextual"/>
+            </w:rPr>
+          </w:pPr>
+          <w:hyperlink w:anchor="_Toc227324896" w:history="1">
+            <w:r>
+              <w:rPr>
+                <w:rStyle w:val="Hyperlink"/>
+                <w:noProof/>
+              </w:rPr>
+              <w:t>April 13</w:t>
+            </w:r>
+            <w:r>
+              <w:rPr>
+                <w:rStyle w:val="Hyperlink"/>
+                <w:noProof/>
+                <w:vertAlign w:val="superscript"/>
+              </w:rPr>
+              <w:t>th</w:t>
+            </w:r>
+            <w:r>
+              <w:rPr>
+                <w:noProof/>
+              </w:rPr>
+              <w:tab/>
+            </w:r>
+            <w:r>
+              <w:rPr>
+                <w:noProof/>
+              </w:rPr>
+              <w:fldChar w:fldCharType="begin"/>
+            </w:r>
+            <w:r>
+              <w:rPr>
+                <w:noProof/>
+              </w:rPr>
+              <w:instrText xml:space="preserve"> PAGEREF _Toc227324896 \h </w:instrText>
+            </w:r>
+            <w:r>
+              <w:rPr>
+                <w:noProof/>
+              </w:rPr>
+            </w:r>
+            <w:r>
+              <w:rPr>
+                <w:noProof/>
+              </w:rPr>
+              <w:fldChar w:fldCharType="separate"/>
+            </w:r>
+            <w:r>
+              <w:rPr>
+                <w:noProof/>
+              </w:rPr>
+              <w:t>14</w:t>
             </w:r>
             <w:r>
               <w:rPr>
@@ -2984,7 +3468,7 @@
         <w:pStyle w:val="Heading1"/>
         <w:jc w:val="center"/>
       </w:pPr>
-      <w:bookmarkStart w:id="0" w:name="_Toc225232349"/>
+      <w:bookmarkStart w:id="0" w:name="_Toc227324883"/>
       <w:r>
         <w:t xml:space="preserve">February </w:t>
       </w:r>
@@ -3033,7 +3517,15 @@
     </w:p>
     <w:p>
       <w:r>
-        <w:t>The team and I discussed our plans on general requirements based on the lecture slides. We came up with some general requirements, did a few dry runs on our finished presentation, with not too many expectations set for the next meeting at the Project Init Stage.</w:t>
+        <w:t>The team and I discussed our plans on general requirements based on the lecture slides. We came up with some general requirements</w:t>
+      </w:r>
+      <w:proofErr w:type="gramStart"/>
+      <w:r>
+        <w:t>, did</w:t>
+      </w:r>
+      <w:proofErr w:type="gramEnd"/>
+      <w:r>
+        <w:t xml:space="preserve"> a few dry runs on our finished presentation, with not too many expectations set for the next meeting at the Project Init Stage.</w:t>
       </w:r>
     </w:p>
     <w:p>
@@ -3041,7 +3533,7 @@
         <w:pStyle w:val="Heading1"/>
         <w:jc w:val="center"/>
       </w:pPr>
-      <w:bookmarkStart w:id="1" w:name="_Toc225232350"/>
+      <w:bookmarkStart w:id="1" w:name="_Toc227324884"/>
       <w:r>
         <w:t>February 11</w:t>
       </w:r>
@@ -3114,6 +3606,7 @@
     </w:p>
     <w:p>
       <w:r>
+        <w:lastRenderedPageBreak/>
         <w:t>I needed to clarify some questions with the Professor, as well as upload the latest version of the SRS document to the GitHub repository.</w:t>
       </w:r>
     </w:p>
@@ -3128,7 +3621,7 @@
         <w:pStyle w:val="Heading1"/>
         <w:jc w:val="center"/>
       </w:pPr>
-      <w:bookmarkStart w:id="2" w:name="_Toc225232351"/>
+      <w:bookmarkStart w:id="2" w:name="_Toc227324885"/>
       <w:r>
         <w:t>February 21</w:t>
       </w:r>
@@ -3166,7 +3659,15 @@
     </w:p>
     <w:p>
       <w:r>
-        <w:t xml:space="preserve">In this meeting, which was isolated to Victor and I, we met about our </w:t>
+        <w:t xml:space="preserve">In this meeting, which was isolated to Victor and </w:t>
+      </w:r>
+      <w:proofErr w:type="gramStart"/>
+      <w:r>
+        <w:t>I</w:t>
+      </w:r>
+      <w:proofErr w:type="gramEnd"/>
+      <w:r>
+        <w:t xml:space="preserve">, we met about our </w:t>
       </w:r>
       <w:r>
         <w:t>plans to divide the work. After the lecture meeting on the 19</w:t>
@@ -3215,7 +3716,7 @@
         <w:pStyle w:val="Heading1"/>
         <w:jc w:val="center"/>
       </w:pPr>
-      <w:bookmarkStart w:id="3" w:name="_Toc225232352"/>
+      <w:bookmarkStart w:id="3" w:name="_Toc227324886"/>
       <w:r>
         <w:t>February 28</w:t>
       </w:r>
@@ -3266,6 +3767,7 @@
     </w:p>
     <w:p>
       <w:r>
+        <w:lastRenderedPageBreak/>
         <w:t xml:space="preserve">Early at 6 am, we met as a team to grind out the rest of the SRS document. We swapped parts to review and revise, Ola and </w:t>
       </w:r>
       <w:proofErr w:type="spellStart"/>
@@ -3286,7 +3788,6 @@
         <w:pStyle w:val="Subtitle"/>
       </w:pPr>
       <w:r>
-        <w:lastRenderedPageBreak/>
         <w:t>By Next Meeting</w:t>
       </w:r>
     </w:p>
@@ -3396,7 +3897,7 @@
         <w:pStyle w:val="Heading1"/>
         <w:jc w:val="center"/>
       </w:pPr>
-      <w:bookmarkStart w:id="4" w:name="_Toc225232353"/>
+      <w:bookmarkStart w:id="4" w:name="_Toc227324887"/>
       <w:r>
         <w:t>March 1</w:t>
       </w:r>
@@ -3439,7 +3940,6 @@
     </w:p>
     <w:p>
       <w:r>
-        <w:lastRenderedPageBreak/>
         <w:t xml:space="preserve">The team starts working on their assigned tasks from yesterday’s meeting, while I contribute to making the first 6 requirements on the slides. </w:t>
       </w:r>
       <w:r>
@@ -3483,7 +3983,7 @@
         <w:pStyle w:val="Heading1"/>
         <w:jc w:val="center"/>
       </w:pPr>
-      <w:bookmarkStart w:id="5" w:name="_Toc225232354"/>
+      <w:bookmarkStart w:id="5" w:name="_Toc227324888"/>
       <w:r>
         <w:t>March 4</w:t>
       </w:r>
@@ -3550,6 +4050,7 @@
     </w:p>
     <w:p>
       <w:r>
+        <w:lastRenderedPageBreak/>
         <w:t xml:space="preserve">Use-Case Diagrams: 5 between both pairs, broken down how the pair wants to complete each Use-Case Diagram. </w:t>
       </w:r>
     </w:p>
@@ -3582,9 +4083,8 @@
         <w:pStyle w:val="Heading1"/>
         <w:jc w:val="center"/>
       </w:pPr>
-      <w:bookmarkStart w:id="6" w:name="_Toc225232355"/>
-      <w:r>
-        <w:lastRenderedPageBreak/>
+      <w:bookmarkStart w:id="6" w:name="_Toc227324889"/>
+      <w:r>
         <w:t>March 7</w:t>
       </w:r>
       <w:r>
@@ -3666,7 +4166,7 @@
         <w:pStyle w:val="Heading1"/>
         <w:jc w:val="center"/>
       </w:pPr>
-      <w:bookmarkStart w:id="7" w:name="_Toc225232356"/>
+      <w:bookmarkStart w:id="7" w:name="_Toc227324890"/>
       <w:r>
         <w:t>March 13</w:t>
       </w:r>
@@ -3710,6 +4210,7 @@
         <w:pStyle w:val="Subtitle"/>
       </w:pPr>
       <w:r>
+        <w:lastRenderedPageBreak/>
         <w:t>Abstract</w:t>
       </w:r>
     </w:p>
@@ -3726,10 +4227,12 @@
         <w:t xml:space="preserve">, ready to merge fully with my own. </w:t>
       </w:r>
       <w:proofErr w:type="spellStart"/>
+      <w:proofErr w:type="gramStart"/>
       <w:r>
         <w:t>Clarize</w:t>
       </w:r>
       <w:proofErr w:type="spellEnd"/>
+      <w:proofErr w:type="gramEnd"/>
       <w:r>
         <w:t xml:space="preserve"> on March 12</w:t>
       </w:r>
@@ -3764,7 +4267,6 @@
         <w:pStyle w:val="Subtitle"/>
       </w:pPr>
       <w:r>
-        <w:lastRenderedPageBreak/>
         <w:t>Action Items</w:t>
       </w:r>
     </w:p>
@@ -3822,7 +4324,7 @@
         <w:pStyle w:val="Heading1"/>
         <w:jc w:val="center"/>
       </w:pPr>
-      <w:bookmarkStart w:id="8" w:name="_Toc225232357"/>
+      <w:bookmarkStart w:id="8" w:name="_Toc227324891"/>
       <w:r>
         <w:t>March 20</w:t>
       </w:r>
@@ -3888,6 +4390,7 @@
       </w:r>
       <w:proofErr w:type="spellStart"/>
       <w:r>
+        <w:lastRenderedPageBreak/>
         <w:t>PlantUML</w:t>
       </w:r>
       <w:proofErr w:type="spellEnd"/>
@@ -3941,7 +4444,6 @@
     </w:p>
     <w:p>
       <w:r>
-        <w:lastRenderedPageBreak/>
         <w:t>Victor: Flesh out the Class candidates and Diagrams. Complete the Client Network Class. If time allows, start on Sequence Diagrams</w:t>
       </w:r>
       <w:r>
@@ -4029,6 +4531,7 @@
         <w:pStyle w:val="Heading1"/>
         <w:jc w:val="center"/>
       </w:pPr>
+      <w:bookmarkStart w:id="9" w:name="_Toc227324892"/>
       <w:r>
         <w:t>March 27</w:t>
       </w:r>
@@ -4038,6 +4541,7 @@
         </w:rPr>
         <w:t>th</w:t>
       </w:r>
+      <w:bookmarkEnd w:id="9"/>
     </w:p>
     <w:p>
       <w:pPr>
@@ -4096,7 +4600,11 @@
       </w:r>
       <w:proofErr w:type="spellEnd"/>
       <w:r>
-        <w:t xml:space="preserve"> format. Overall, this meeting focused on completing and reviewing any leftover use cases and class diagrams that still needed to be finished in our SDS document. </w:t>
+        <w:t xml:space="preserve"> format. Overall, this meeting </w:t>
+      </w:r>
+      <w:r>
+        <w:lastRenderedPageBreak/>
+        <w:t xml:space="preserve">focused on completing and reviewing any leftover use cases and class diagrams that still needed to be finished in our SDS document. </w:t>
       </w:r>
     </w:p>
     <w:p/>
@@ -4116,7 +4624,6 @@
     <w:p>
       <w:proofErr w:type="spellStart"/>
       <w:r>
-        <w:lastRenderedPageBreak/>
         <w:t>Clarize</w:t>
       </w:r>
       <w:proofErr w:type="spellEnd"/>
@@ -4126,13 +4633,18 @@
     </w:p>
     <w:p>
       <w:r>
-        <w:t xml:space="preserve">Victor: Will focus on doing some sequence diagrams that demonstrate the overall main and general use cases by the end user. In addition, will also update this </w:t>
+        <w:t xml:space="preserve">Victor: Will focus on doing some sequence diagrams that demonstrate the overall main and general use cases by the end user. In addition, will also update </w:t>
+      </w:r>
+      <w:proofErr w:type="gramStart"/>
+      <w:r>
+        <w:t xml:space="preserve">this </w:t>
       </w:r>
       <w:proofErr w:type="spellStart"/>
       <w:r>
         <w:t>weeks</w:t>
       </w:r>
       <w:proofErr w:type="spellEnd"/>
+      <w:proofErr w:type="gramEnd"/>
       <w:r>
         <w:t xml:space="preserve"> meeting minutes. </w:t>
       </w:r>
@@ -4166,6 +4678,7 @@
         <w:pStyle w:val="Heading1"/>
         <w:jc w:val="center"/>
       </w:pPr>
+      <w:bookmarkStart w:id="10" w:name="_Toc227324893"/>
       <w:r>
         <w:t>April 4</w:t>
       </w:r>
@@ -4175,6 +4688,7 @@
         </w:rPr>
         <w:t>th</w:t>
       </w:r>
+      <w:bookmarkEnd w:id="10"/>
     </w:p>
     <w:p>
       <w:pPr>
@@ -4221,7 +4735,15 @@
       </w:r>
       <w:proofErr w:type="spellEnd"/>
       <w:r>
-        <w:t xml:space="preserve"> introduced and walked through the general flows of the way users interact with the Communication Application System, generalizing a lot of the interactions. Victor mentioned that he was done with his Sequence Diagrams, but has not had the chance to upload it, but will do so by tomorrow after 6 pm. </w:t>
+        <w:t xml:space="preserve"> introduced and walked through the general flows of the way users interact with the Communication Application System, generalizing a lot of the interactions. Victor mentioned that he was done with his Sequence Diagrams, but has not had the chance to upload </w:t>
+      </w:r>
+      <w:proofErr w:type="gramStart"/>
+      <w:r>
+        <w:t>it</w:t>
+      </w:r>
+      <w:proofErr w:type="gramEnd"/>
+      <w:r>
+        <w:t xml:space="preserve">, but will do so by tomorrow after 6 pm. </w:t>
       </w:r>
     </w:p>
     <w:p>
@@ -4229,6 +4751,7 @@
         <w:pStyle w:val="Subtitle"/>
       </w:pPr>
       <w:r>
+        <w:lastRenderedPageBreak/>
         <w:t>Action Items</w:t>
       </w:r>
     </w:p>
@@ -4266,7 +4789,6 @@
         <w:pStyle w:val="Subtitle"/>
       </w:pPr>
       <w:r>
-        <w:lastRenderedPageBreak/>
         <w:t>By Next Meeting</w:t>
       </w:r>
     </w:p>
@@ -4290,11 +4812,9 @@
         <w:pStyle w:val="Heading1"/>
         <w:jc w:val="center"/>
       </w:pPr>
-      <w:r>
-        <w:t xml:space="preserve">April </w:t>
-      </w:r>
-      <w:r>
-        <w:t>8</w:t>
+      <w:bookmarkStart w:id="11" w:name="_Toc227324894"/>
+      <w:r>
+        <w:t>April 8</w:t>
       </w:r>
       <w:r>
         <w:rPr>
@@ -4302,6 +4822,7 @@
         </w:rPr>
         <w:t>th</w:t>
       </w:r>
+      <w:bookmarkEnd w:id="11"/>
     </w:p>
     <w:p>
       <w:pPr>
@@ -4377,21 +4898,12 @@
       </w:r>
       <w:proofErr w:type="spellEnd"/>
       <w:r>
-        <w:t xml:space="preserve">: </w:t>
-      </w:r>
-      <w:r>
-        <w:t>SDS; get the images + brief description of relationship</w:t>
-      </w:r>
-      <w:r>
-        <w:t xml:space="preserve"> (edit the one current on the repo), and then overwrite the old SDS on the current repo.</w:t>
-      </w:r>
-    </w:p>
-    <w:p>
-      <w:r>
-        <w:t xml:space="preserve">Victor: </w:t>
-      </w:r>
-      <w:r>
-        <w:t>SRS; clean up requirements that were relevant to any removed + copy and pasting new diagrams over from the SDS.</w:t>
+        <w:t>: SDS; get the images + brief description of relationship (edit the one current on the repo), and then overwrite the old SDS on the current repo.</w:t>
+      </w:r>
+    </w:p>
+    <w:p>
+      <w:r>
+        <w:t>Victor: SRS; clean up requirements that were relevant to any removed + copy and pasting new diagrams over from the SDS.</w:t>
       </w:r>
     </w:p>
     <w:p>
@@ -4399,12 +4911,415 @@
         <w:pStyle w:val="Subtitle"/>
       </w:pPr>
       <w:r>
+        <w:lastRenderedPageBreak/>
         <w:t>By Next Meeting</w:t>
       </w:r>
     </w:p>
     <w:p>
       <w:r>
         <w:t xml:space="preserve">All team members have started implementation of the Communications Application to the first few commits. At minimum, class skeletons with getters and setters if applicable. </w:t>
+      </w:r>
+    </w:p>
+    <w:p/>
+    <w:p>
+      <w:pPr>
+        <w:pStyle w:val="Heading1"/>
+        <w:jc w:val="center"/>
+      </w:pPr>
+      <w:bookmarkStart w:id="12" w:name="_Toc227324895"/>
+      <w:r>
+        <w:t>April 10</w:t>
+      </w:r>
+      <w:r>
+        <w:rPr>
+          <w:vertAlign w:val="superscript"/>
+        </w:rPr>
+        <w:t>th</w:t>
+      </w:r>
+      <w:bookmarkEnd w:id="12"/>
+    </w:p>
+    <w:p>
+      <w:pPr>
+        <w:pStyle w:val="Subtitle"/>
+      </w:pPr>
+      <w:r>
+        <w:t>Attendance</w:t>
+      </w:r>
+    </w:p>
+    <w:p>
+      <w:r>
+        <w:t>Darien, Victor</w:t>
+      </w:r>
+    </w:p>
+    <w:p>
+      <w:pPr>
+        <w:pStyle w:val="Subtitle"/>
+      </w:pPr>
+      <w:r>
+        <w:t>Abstract</w:t>
+      </w:r>
+    </w:p>
+    <w:p>
+      <w:r>
+        <w:t xml:space="preserve">Victor and Darien reviewed the usage of git, specifically how to use fetch, pull, make new branches, switch between branches, commits, and pushing changes. We also observed how to make and manage pull requests using GitHub’s website. The discussion of and importance of working on branches was also noted upon. Lastly, the meeting wrapped up with connecting locally cloned repositories to eclipse, and using the git bash terminal to commit and push any new changes to branches made through the eclipse IDE. </w:t>
+      </w:r>
+    </w:p>
+    <w:p>
+      <w:pPr>
+        <w:pStyle w:val="Subtitle"/>
+      </w:pPr>
+      <w:r>
+        <w:t>Action Items</w:t>
+      </w:r>
+    </w:p>
+    <w:p>
+      <w:r>
+        <w:t xml:space="preserve">Darien: Implement the </w:t>
+      </w:r>
+      <w:proofErr w:type="spellStart"/>
+      <w:r>
+        <w:t>ClientNetwork</w:t>
+      </w:r>
+      <w:proofErr w:type="spellEnd"/>
+      <w:r>
+        <w:t xml:space="preserve">, Request, </w:t>
+      </w:r>
+      <w:proofErr w:type="spellStart"/>
+      <w:r>
+        <w:t>ServerNetwork</w:t>
+      </w:r>
+      <w:proofErr w:type="spellEnd"/>
+      <w:r>
+        <w:t xml:space="preserve">, </w:t>
+      </w:r>
+      <w:proofErr w:type="spellStart"/>
+      <w:r>
+        <w:t>ClientHandler</w:t>
+      </w:r>
+      <w:proofErr w:type="spellEnd"/>
+      <w:r>
+        <w:t xml:space="preserve">, User, and </w:t>
+      </w:r>
+      <w:proofErr w:type="spellStart"/>
+      <w:r>
+        <w:t>ITUser</w:t>
+      </w:r>
+      <w:proofErr w:type="spellEnd"/>
+      <w:r>
+        <w:t xml:space="preserve"> classes, including any dependencies they require. Manage pull requests</w:t>
+      </w:r>
+      <w:r>
+        <w:t>.</w:t>
+      </w:r>
+    </w:p>
+    <w:p>
+      <w:r>
+        <w:t xml:space="preserve">Victor: Implement the, GUI, </w:t>
+      </w:r>
+      <w:proofErr w:type="spellStart"/>
+      <w:r>
+        <w:t>LoginView</w:t>
+      </w:r>
+      <w:proofErr w:type="spellEnd"/>
+      <w:r>
+        <w:t xml:space="preserve">, </w:t>
+      </w:r>
+      <w:proofErr w:type="spellStart"/>
+      <w:r>
+        <w:t>ChatOverlayView</w:t>
+      </w:r>
+      <w:proofErr w:type="spellEnd"/>
+      <w:r>
+        <w:t xml:space="preserve">, </w:t>
+      </w:r>
+      <w:proofErr w:type="spellStart"/>
+      <w:r>
+        <w:t>GroupCreationView</w:t>
+      </w:r>
+      <w:proofErr w:type="spellEnd"/>
+      <w:r>
+        <w:t xml:space="preserve">, and </w:t>
+      </w:r>
+      <w:proofErr w:type="spellStart"/>
+      <w:r>
+        <w:t>ITControlPanelView</w:t>
+      </w:r>
+      <w:proofErr w:type="spellEnd"/>
+      <w:r>
+        <w:t xml:space="preserve">, including any dependencies they require. </w:t>
+      </w:r>
+    </w:p>
+    <w:p>
+      <w:proofErr w:type="spellStart"/>
+      <w:r>
+        <w:t>Clarize</w:t>
+      </w:r>
+      <w:proofErr w:type="spellEnd"/>
+      <w:r>
+        <w:t xml:space="preserve">: Implement the </w:t>
+      </w:r>
+      <w:proofErr w:type="spellStart"/>
+      <w:r>
+        <w:t>RequestHandler</w:t>
+      </w:r>
+      <w:proofErr w:type="spellEnd"/>
+      <w:r>
+        <w:t xml:space="preserve">, Log, </w:t>
+      </w:r>
+      <w:proofErr w:type="spellStart"/>
+      <w:r>
+        <w:t>UserAuthenticator</w:t>
+      </w:r>
+      <w:proofErr w:type="spellEnd"/>
+      <w:r>
+        <w:t xml:space="preserve">, </w:t>
+      </w:r>
+      <w:proofErr w:type="spellStart"/>
+      <w:r>
+        <w:t>ConnectionManager</w:t>
+      </w:r>
+      <w:proofErr w:type="spellEnd"/>
+      <w:r>
+        <w:t xml:space="preserve">, </w:t>
+      </w:r>
+      <w:proofErr w:type="spellStart"/>
+      <w:r>
+        <w:t>StorageManager</w:t>
+      </w:r>
+      <w:proofErr w:type="spellEnd"/>
+      <w:r>
+        <w:t>, and Logging Manger, including any dependencies they require.</w:t>
+      </w:r>
+    </w:p>
+    <w:p>
+      <w:r>
+        <w:t>All: Make sure basic tests work, such as getters, setters, looping, as well as array usage</w:t>
+      </w:r>
+      <w:r>
+        <w:t xml:space="preserve"> if applicable. </w:t>
+      </w:r>
+    </w:p>
+    <w:p>
+      <w:pPr>
+        <w:pStyle w:val="Subtitle"/>
+      </w:pPr>
+      <w:r>
+        <w:t>By Next Meeting</w:t>
+      </w:r>
+    </w:p>
+    <w:p>
+      <w:r>
+        <w:t xml:space="preserve">Main branch is up-to-date with all implementations and testing. </w:t>
+      </w:r>
+    </w:p>
+    <w:p/>
+    <w:p>
+      <w:pPr>
+        <w:pStyle w:val="Heading1"/>
+        <w:jc w:val="center"/>
+      </w:pPr>
+      <w:bookmarkStart w:id="13" w:name="_Toc227324896"/>
+      <w:r>
+        <w:lastRenderedPageBreak/>
+        <w:t>April 13</w:t>
+      </w:r>
+      <w:r>
+        <w:rPr>
+          <w:vertAlign w:val="superscript"/>
+        </w:rPr>
+        <w:t>th</w:t>
+      </w:r>
+      <w:bookmarkEnd w:id="13"/>
+    </w:p>
+    <w:p>
+      <w:pPr>
+        <w:pStyle w:val="Subtitle"/>
+      </w:pPr>
+      <w:r>
+        <w:t>Attendance</w:t>
+      </w:r>
+    </w:p>
+    <w:p>
+      <w:r>
+        <w:t xml:space="preserve">Darien, Victor, </w:t>
+      </w:r>
+      <w:proofErr w:type="spellStart"/>
+      <w:r>
+        <w:t>Clarize</w:t>
+      </w:r>
+      <w:proofErr w:type="spellEnd"/>
+    </w:p>
+    <w:p>
+      <w:pPr>
+        <w:pStyle w:val="Subtitle"/>
+      </w:pPr>
+      <w:r>
+        <w:t>Abstract</w:t>
+      </w:r>
+    </w:p>
+    <w:p>
+      <w:r>
+        <w:t xml:space="preserve">Darien showcased the work and implementation of the following classes: </w:t>
+      </w:r>
+      <w:proofErr w:type="spellStart"/>
+      <w:r>
+        <w:t>ClientNetwork</w:t>
+      </w:r>
+      <w:proofErr w:type="spellEnd"/>
+      <w:r>
+        <w:t xml:space="preserve">, Request, </w:t>
+      </w:r>
+      <w:proofErr w:type="spellStart"/>
+      <w:r>
+        <w:t>ServerNetwork</w:t>
+      </w:r>
+      <w:proofErr w:type="spellEnd"/>
+      <w:r>
+        <w:t xml:space="preserve">, </w:t>
+      </w:r>
+      <w:proofErr w:type="spellStart"/>
+      <w:r>
+        <w:t>ClientHandler</w:t>
+      </w:r>
+      <w:proofErr w:type="spellEnd"/>
+      <w:r>
+        <w:t xml:space="preserve">, User and </w:t>
+      </w:r>
+      <w:proofErr w:type="spellStart"/>
+      <w:r>
+        <w:t>ITUser</w:t>
+      </w:r>
+      <w:proofErr w:type="spellEnd"/>
+      <w:r>
+        <w:t xml:space="preserve"> classes. He showcased the demonstration of how these classes used and if their operations were expected. After showcasing, he requested the team for any questions and potential classes/implementations he needs from the other members to move forward. Action Items are effectively due next meeting on April 17th. Post-meeting, pull requests were managed and the main branch was pushed and cleaned. </w:t>
+      </w:r>
+    </w:p>
+    <w:p>
+      <w:pPr>
+        <w:pStyle w:val="Subtitle"/>
+      </w:pPr>
+      <w:r>
+        <w:t>Action Items</w:t>
+      </w:r>
+    </w:p>
+    <w:p>
+      <w:r>
+        <w:t xml:space="preserve">Darien: </w:t>
+      </w:r>
+      <w:r>
+        <w:t xml:space="preserve">Continue to refine implementations and </w:t>
+      </w:r>
+      <w:r>
+        <w:t>await</w:t>
+      </w:r>
+      <w:r>
+        <w:t xml:space="preserve"> further GUI implementation and Server </w:t>
+      </w:r>
+      <w:r>
+        <w:t>implementations</w:t>
+      </w:r>
+      <w:r>
+        <w:t xml:space="preserve">. </w:t>
+      </w:r>
+      <w:r>
+        <w:t>Proceed with monitoring and managing pull requests.</w:t>
+      </w:r>
+    </w:p>
+    <w:p>
+      <w:r>
+        <w:t xml:space="preserve">Victor: Implement the, GUI, </w:t>
+      </w:r>
+      <w:proofErr w:type="spellStart"/>
+      <w:r>
+        <w:t>LoginView</w:t>
+      </w:r>
+      <w:proofErr w:type="spellEnd"/>
+      <w:r>
+        <w:t xml:space="preserve">, </w:t>
+      </w:r>
+      <w:proofErr w:type="spellStart"/>
+      <w:r>
+        <w:t>ChatOverlayView</w:t>
+      </w:r>
+      <w:proofErr w:type="spellEnd"/>
+      <w:r>
+        <w:t xml:space="preserve">, </w:t>
+      </w:r>
+      <w:proofErr w:type="spellStart"/>
+      <w:r>
+        <w:t>GroupCreationView</w:t>
+      </w:r>
+      <w:proofErr w:type="spellEnd"/>
+      <w:r>
+        <w:t xml:space="preserve">, and </w:t>
+      </w:r>
+      <w:proofErr w:type="spellStart"/>
+      <w:r>
+        <w:t>ITControlPanelView</w:t>
+      </w:r>
+      <w:proofErr w:type="spellEnd"/>
+      <w:r>
+        <w:t xml:space="preserve">, including any dependencies they require. </w:t>
+      </w:r>
+    </w:p>
+    <w:p>
+      <w:proofErr w:type="spellStart"/>
+      <w:r>
+        <w:t>Clarize</w:t>
+      </w:r>
+      <w:proofErr w:type="spellEnd"/>
+      <w:r>
+        <w:t xml:space="preserve">: Implement the </w:t>
+      </w:r>
+      <w:proofErr w:type="spellStart"/>
+      <w:r>
+        <w:t>RequestHandler</w:t>
+      </w:r>
+      <w:proofErr w:type="spellEnd"/>
+      <w:r>
+        <w:t xml:space="preserve">, Log, </w:t>
+      </w:r>
+      <w:proofErr w:type="spellStart"/>
+      <w:r>
+        <w:t>UserAuthenticator</w:t>
+      </w:r>
+      <w:proofErr w:type="spellEnd"/>
+      <w:r>
+        <w:t xml:space="preserve">, </w:t>
+      </w:r>
+      <w:proofErr w:type="spellStart"/>
+      <w:r>
+        <w:t>ConnectionManager</w:t>
+      </w:r>
+      <w:proofErr w:type="spellEnd"/>
+      <w:r>
+        <w:t xml:space="preserve">, </w:t>
+      </w:r>
+      <w:proofErr w:type="spellStart"/>
+      <w:r>
+        <w:t>StorageManager</w:t>
+      </w:r>
+      <w:proofErr w:type="spellEnd"/>
+      <w:r>
+        <w:t>, and Logging Manger, including any dependencies they require.</w:t>
+      </w:r>
+    </w:p>
+    <w:p>
+      <w:r>
+        <w:t xml:space="preserve">All: Make sure basic tests work, such as getters, setters, looping, as well as array usage if applicable. </w:t>
+      </w:r>
+    </w:p>
+    <w:p>
+      <w:pPr>
+        <w:pStyle w:val="Subtitle"/>
+      </w:pPr>
+      <w:r>
+        <w:t>By Next Meeting</w:t>
+      </w:r>
+    </w:p>
+    <w:p>
+      <w:r>
+        <w:t xml:space="preserve">Main branch is up-to-date with all implementations and testing. </w:t>
       </w:r>
     </w:p>
     <w:p/>

</xml_diff>